<commit_message>
Working version before adding progress checkpoints to mass sim
</commit_message>
<xml_diff>
--- a/docs/Card_Documentation.docx
+++ b/docs/Card_Documentation.docx
@@ -108,7 +108,21 @@
           <w:b/>
           <w:bCs/>
         </w:rPr>
-        <w:t>Abilities avoided:</w:t>
+        <w:t xml:space="preserve">Abilities </w:t>
+      </w:r>
+      <w:r>
+        <w:rPr>
+          <w:b/>
+          <w:bCs/>
+        </w:rPr>
+        <w:t>ignored</w:t>
+      </w:r>
+      <w:r>
+        <w:rPr>
+          <w:b/>
+          <w:bCs/>
+        </w:rPr>
+        <w:t>:</w:t>
       </w:r>
       <w:r>
         <w:rPr>
@@ -135,6 +149,17 @@
     </w:p>
     <w:p>
       <w:r>
+        <w:t xml:space="preserve">Abilities that reveal information about opponent </w:t>
+      </w:r>
+      <w:r>
+        <w:t>cards in hand</w:t>
+      </w:r>
+      <w:r>
+        <w:t xml:space="preserve"> are ignored.</w:t>
+      </w:r>
+    </w:p>
+    <w:p>
+      <w:r>
         <w:t>Abilities that spawn units on other areas or move units to other areas are ignored.</w:t>
       </w:r>
     </w:p>
@@ -255,12 +280,12 @@
           <w:b/>
           <w:bCs/>
         </w:rPr>
+        <w:lastRenderedPageBreak/>
         <w:t>Break the Line</w:t>
       </w:r>
     </w:p>
     <w:p>
       <w:r>
-        <w:lastRenderedPageBreak/>
         <w:t xml:space="preserve">Unit: Opponent chooses lowest value card. </w:t>
       </w:r>
       <w:r>
@@ -273,15 +298,7 @@
         <w:t>2nd</w:t>
       </w:r>
       <w:r>
-        <w:t xml:space="preserve"> </w:t>
-      </w:r>
-      <w:proofErr w:type="gramStart"/>
-      <w:r>
-        <w:t>amount</w:t>
-      </w:r>
-      <w:proofErr w:type="gramEnd"/>
-      <w:r>
-        <w:t xml:space="preserve"> of icons on the card, </w:t>
+        <w:t xml:space="preserve"> amount of icons on the card, </w:t>
       </w:r>
       <w:r>
         <w:t>3rd</w:t>
@@ -341,17 +358,8 @@
           <w:b/>
           <w:bCs/>
         </w:rPr>
-        <w:t xml:space="preserve">Mark of </w:t>
-      </w:r>
-      <w:proofErr w:type="spellStart"/>
-      <w:r>
-        <w:rPr>
-          <w:b/>
-          <w:bCs/>
-        </w:rPr>
-        <w:t>Nurgle</w:t>
-      </w:r>
-      <w:proofErr w:type="spellEnd"/>
+        <w:t>Mark of Nurgle</w:t>
+      </w:r>
     </w:p>
     <w:p>
       <w:r>
@@ -1097,6 +1105,7 @@
   <w:style w:type="character" w:default="1" w:styleId="DefaultParagraphFont">
     <w:name w:val="Default Paragraph Font"/>
     <w:uiPriority w:val="1"/>
+    <w:semiHidden/>
     <w:unhideWhenUsed/>
   </w:style>
   <w:style w:type="table" w:default="1" w:styleId="TableNormal">

</xml_diff>

<commit_message>
Made sim data export to res and added some documentation on start page.
</commit_message>
<xml_diff>
--- a/docs/Card_Documentation.docx
+++ b/docs/Card_Documentation.docx
@@ -9,6 +9,2098 @@
           <w:bCs/>
         </w:rPr>
       </w:pPr>
+    </w:p>
+    <w:p>
+      <w:pPr>
+        <w:rPr>
+          <w:b/>
+          <w:bCs/>
+        </w:rPr>
+      </w:pPr>
+      <w:r>
+        <w:rPr>
+          <w:b/>
+          <w:bCs/>
+        </w:rPr>
+        <w:t>Foreword:</w:t>
+      </w:r>
+    </w:p>
+    <w:p>
+      <w:r>
+        <w:t>This is documentation on how the combat sim works.</w:t>
+      </w:r>
+      <w:r>
+        <w:t xml:space="preserve"> You should be familiar with the game’s rules since they won’t be explained here.</w:t>
+      </w:r>
+    </w:p>
+    <w:p>
+      <w:r>
+        <w:t>--</w:t>
+      </w:r>
+      <w:r>
+        <w:t xml:space="preserve"> </w:t>
+      </w:r>
+    </w:p>
+    <w:p>
+      <w:r>
+        <w:t>Cards played from hand are completely random with no strategies applied by factions. Below is the how each match is constructed.</w:t>
+      </w:r>
+    </w:p>
+    <w:p/>
+    <w:p>
+      <w:pPr>
+        <w:rPr>
+          <w:b/>
+          <w:bCs/>
+        </w:rPr>
+      </w:pPr>
+      <w:r>
+        <w:rPr>
+          <w:b/>
+          <w:bCs/>
+        </w:rPr>
+        <w:t>How damage is selected:</w:t>
+      </w:r>
+    </w:p>
+    <w:p>
+      <w:r>
+        <w:t>When a side (attacker or defender) needs to allocate damage to their units the following is how the selection operates.</w:t>
+      </w:r>
+    </w:p>
+    <w:p/>
+    <w:p>
+      <w:pPr>
+        <w:rPr>
+          <w:b/>
+          <w:bCs/>
+        </w:rPr>
+      </w:pPr>
+      <w:r>
+        <w:rPr>
+          <w:b/>
+          <w:bCs/>
+        </w:rPr>
+        <w:t>Step 1: The "Perfect Absorption" Strategy (Zero Casualties)</w:t>
+      </w:r>
+    </w:p>
+    <w:p>
+      <w:r>
+        <w:t xml:space="preserve">The AI scans all squads looking for a single, perfect target that can absorb the entire remaining damage pool in a single hit </w:t>
+      </w:r>
+      <w:r>
+        <w:rPr>
+          <w:i/>
+          <w:iCs/>
+        </w:rPr>
+        <w:t>without dying</w:t>
+      </w:r>
+      <w:r>
+        <w:t>.</w:t>
+      </w:r>
+    </w:p>
+    <w:p>
+      <w:r>
+        <w:t xml:space="preserve">To choose this target, the engine checks if you have steady, </w:t>
+      </w:r>
+      <w:r>
+        <w:t>unrouted</w:t>
+      </w:r>
+      <w:r>
+        <w:t xml:space="preserve"> </w:t>
+      </w:r>
+      <w:r>
+        <w:t>units</w:t>
+      </w:r>
+      <w:r>
+        <w:t xml:space="preserve"> left on the field</w:t>
+      </w:r>
+      <w:r>
+        <w:t xml:space="preserve">. </w:t>
+      </w:r>
+      <w:r>
+        <w:t>It then applies a strict tactical hierarchy:</w:t>
+      </w:r>
+    </w:p>
+    <w:p>
+      <w:pPr>
+        <w:numPr>
+          <w:ilvl w:val="0"/>
+          <w:numId w:val="3"/>
+        </w:numPr>
+      </w:pPr>
+      <w:r>
+        <w:rPr>
+          <w:b/>
+          <w:bCs/>
+        </w:rPr>
+        <w:t>Scenario A: The Front Line Holds</w:t>
+      </w:r>
+      <w:r>
+        <w:t xml:space="preserve"> (Unrouted Units Exist) If you have steady troops standing, already routed units are completely locked out and cannot take damage. The engine is forced to choose a healthy, unrouted unit with enough current Hit Points (HP) to survive the full damage pool.</w:t>
+      </w:r>
+    </w:p>
+    <w:p>
+      <w:pPr>
+        <w:numPr>
+          <w:ilvl w:val="0"/>
+          <w:numId w:val="3"/>
+        </w:numPr>
+      </w:pPr>
+      <w:r>
+        <w:rPr>
+          <w:b/>
+          <w:bCs/>
+        </w:rPr>
+        <w:t>Scenario B: Complete Front-Line Collapse</w:t>
+      </w:r>
+      <w:r>
+        <w:t xml:space="preserve"> (No Unrouted Units Left) If </w:t>
+      </w:r>
+      <w:r>
+        <w:rPr>
+          <w:i/>
+          <w:iCs/>
+        </w:rPr>
+        <w:t xml:space="preserve">every </w:t>
+      </w:r>
+      <w:r>
+        <w:rPr>
+          <w:i/>
+          <w:iCs/>
+        </w:rPr>
+        <w:t>unit</w:t>
+      </w:r>
+      <w:r>
+        <w:t xml:space="preserve"> on your side of the battlefield is already </w:t>
+      </w:r>
+      <w:r>
+        <w:t xml:space="preserve">routed </w:t>
+      </w:r>
+      <w:r>
+        <w:t>the incoming damage hits an already routed unit that has enough HP to absorb the blow.</w:t>
+      </w:r>
+    </w:p>
+    <w:p>
+      <w:r>
+        <w:t>If a perfect target is found in either scenario, it absorbs 100% of the damage pool, and the engine stops searching.</w:t>
+      </w:r>
+    </w:p>
+    <w:p/>
+    <w:p>
+      <w:pPr>
+        <w:rPr>
+          <w:b/>
+          <w:bCs/>
+        </w:rPr>
+      </w:pPr>
+    </w:p>
+    <w:p>
+      <w:pPr>
+        <w:rPr>
+          <w:b/>
+          <w:bCs/>
+        </w:rPr>
+      </w:pPr>
+    </w:p>
+    <w:p>
+      <w:pPr>
+        <w:rPr>
+          <w:b/>
+          <w:bCs/>
+        </w:rPr>
+      </w:pPr>
+      <w:r>
+        <w:rPr>
+          <w:b/>
+          <w:bCs/>
+        </w:rPr>
+        <w:t>Step 2: The "Lethal Sacrifice" Fallback (Casualty Management)</w:t>
+      </w:r>
+    </w:p>
+    <w:p>
+      <w:r>
+        <w:lastRenderedPageBreak/>
+        <w:t xml:space="preserve">If the damage pool is too large to be cleanly absorbed by a single unit in Step 1, the engine is forced to start killing units to chip away at the total damage. It looks for a </w:t>
+      </w:r>
+      <w:r>
+        <w:rPr>
+          <w:b/>
+          <w:bCs/>
+        </w:rPr>
+        <w:t>Sacrifice Target</w:t>
+      </w:r>
+      <w:r>
+        <w:t xml:space="preserve"> to take a lethal blow.</w:t>
+      </w:r>
+    </w:p>
+    <w:p>
+      <w:pPr>
+        <w:numPr>
+          <w:ilvl w:val="0"/>
+          <w:numId w:val="4"/>
+        </w:numPr>
+      </w:pPr>
+      <w:r>
+        <w:rPr>
+          <w:b/>
+          <w:bCs/>
+        </w:rPr>
+        <w:t>Damage Reduction:</w:t>
+      </w:r>
+      <w:r>
+        <w:t xml:space="preserve"> The engine selects a unit, records its remaining HP, and subtracts that exact amount from the incoming </w:t>
+      </w:r>
+      <w:proofErr w:type="spellStart"/>
+      <w:r>
+        <w:t>total_damage</w:t>
+      </w:r>
+      <w:proofErr w:type="spellEnd"/>
+      <w:r>
+        <w:t xml:space="preserve"> pool.</w:t>
+      </w:r>
+    </w:p>
+    <w:p>
+      <w:pPr>
+        <w:numPr>
+          <w:ilvl w:val="0"/>
+          <w:numId w:val="4"/>
+        </w:numPr>
+      </w:pPr>
+      <w:r>
+        <w:rPr>
+          <w:b/>
+          <w:bCs/>
+        </w:rPr>
+        <w:t>Unit Destruction:</w:t>
+      </w:r>
+      <w:r>
+        <w:t xml:space="preserve"> The chosen unit's figure is completely destroyed and wiped from the battlefield.</w:t>
+      </w:r>
+    </w:p>
+    <w:p>
+      <w:pPr>
+        <w:numPr>
+          <w:ilvl w:val="0"/>
+          <w:numId w:val="4"/>
+        </w:numPr>
+      </w:pPr>
+      <w:r>
+        <w:rPr>
+          <w:b/>
+          <w:bCs/>
+        </w:rPr>
+        <w:t>The "Forced Overkill" Rule (</w:t>
+      </w:r>
+      <w:proofErr w:type="spellStart"/>
+      <w:r>
+        <w:rPr>
+          <w:b/>
+          <w:bCs/>
+        </w:rPr>
+        <w:t>is_routing_lethal</w:t>
+      </w:r>
+      <w:proofErr w:type="spellEnd"/>
+      <w:r>
+        <w:rPr>
+          <w:b/>
+          <w:bCs/>
+        </w:rPr>
+        <w:t>):</w:t>
+      </w:r>
+      <w:r>
+        <w:t xml:space="preserve"> If your game rules dictate that a panic/rout state is instantly fatal (</w:t>
+      </w:r>
+      <w:proofErr w:type="spellStart"/>
+      <w:r>
+        <w:t>is_routing_lethal</w:t>
+      </w:r>
+      <w:proofErr w:type="spellEnd"/>
+      <w:r>
+        <w:t xml:space="preserve"> = true), the engine will aggressively execute a healthy unit even if the remaining damage wouldn't normally kill it. It forces an overkill scenario because a partial hit would cause a panic state, which is treated as death anyway.</w:t>
+      </w:r>
+    </w:p>
+    <w:p>
+      <w:r>
+        <w:t xml:space="preserve">Once the unit is sacrificed and the damage pool is reduced, the loop resets back to </w:t>
+      </w:r>
+      <w:r>
+        <w:rPr>
+          <w:b/>
+          <w:bCs/>
+        </w:rPr>
+        <w:t>Step 1</w:t>
+      </w:r>
+      <w:r>
+        <w:t xml:space="preserve"> with whatever damage is left over. It repeats this process until the damage pool hits 0 or all units are wiped out.</w:t>
+      </w:r>
+    </w:p>
+    <w:p/>
+    <w:p/>
+    <w:p>
+      <w:pPr>
+        <w:rPr>
+          <w:b/>
+          <w:bCs/>
+        </w:rPr>
+      </w:pPr>
+      <w:r>
+        <w:rPr>
+          <w:b/>
+          <w:bCs/>
+        </w:rPr>
+        <w:t>1. Unit Tier Selection Odds</w:t>
+      </w:r>
+    </w:p>
+    <w:p>
+      <w:pPr>
+        <w:rPr>
+          <w:b/>
+          <w:bCs/>
+        </w:rPr>
+      </w:pPr>
+      <w:r>
+        <w:rPr>
+          <w:b/>
+          <w:bCs/>
+        </w:rPr>
+        <w:t>When the engine picks a unit for a squad slot, these are the chances for each tier:</w:t>
+      </w:r>
+    </w:p>
+    <w:tbl>
+      <w:tblPr>
+        <w:tblW w:w="0" w:type="auto"/>
+        <w:tblCellSpacing w:w="15" w:type="dxa"/>
+        <w:tblCellMar>
+          <w:top w:w="15" w:type="dxa"/>
+          <w:left w:w="15" w:type="dxa"/>
+          <w:bottom w:w="15" w:type="dxa"/>
+          <w:right w:w="15" w:type="dxa"/>
+        </w:tblCellMar>
+        <w:tblLook w:val="04A0" w:firstRow="1" w:lastRow="0" w:firstColumn="1" w:lastColumn="0" w:noHBand="0" w:noVBand="1"/>
+      </w:tblPr>
+      <w:tblGrid>
+        <w:gridCol w:w="1390"/>
+        <w:gridCol w:w="645"/>
+        <w:gridCol w:w="645"/>
+        <w:gridCol w:w="645"/>
+        <w:gridCol w:w="660"/>
+      </w:tblGrid>
+      <w:tr>
+        <w:trPr>
+          <w:tblHeader/>
+          <w:tblCellSpacing w:w="15" w:type="dxa"/>
+        </w:trPr>
+        <w:tc>
+          <w:tcPr>
+            <w:tcW w:w="0" w:type="auto"/>
+            <w:vAlign w:val="center"/>
+            <w:hideMark/>
+          </w:tcPr>
+          <w:p>
+            <w:pPr>
+              <w:rPr>
+                <w:b/>
+                <w:bCs/>
+              </w:rPr>
+            </w:pPr>
+            <w:r>
+              <w:rPr>
+                <w:b/>
+                <w:bCs/>
+              </w:rPr>
+              <w:t>Game Stage</w:t>
+            </w:r>
+          </w:p>
+        </w:tc>
+        <w:tc>
+          <w:tcPr>
+            <w:tcW w:w="0" w:type="auto"/>
+            <w:vAlign w:val="center"/>
+            <w:hideMark/>
+          </w:tcPr>
+          <w:p>
+            <w:pPr>
+              <w:rPr>
+                <w:b/>
+                <w:bCs/>
+              </w:rPr>
+            </w:pPr>
+            <w:r>
+              <w:rPr>
+                <w:b/>
+                <w:bCs/>
+              </w:rPr>
+              <w:t xml:space="preserve">Tier 0 </w:t>
+            </w:r>
+            <w:r>
+              <w:rPr>
+                <w:b/>
+                <w:bCs/>
+              </w:rPr>
+              <w:t xml:space="preserve"> </w:t>
+            </w:r>
+          </w:p>
+        </w:tc>
+        <w:tc>
+          <w:tcPr>
+            <w:tcW w:w="0" w:type="auto"/>
+            <w:vAlign w:val="center"/>
+            <w:hideMark/>
+          </w:tcPr>
+          <w:p>
+            <w:pPr>
+              <w:rPr>
+                <w:b/>
+                <w:bCs/>
+              </w:rPr>
+            </w:pPr>
+            <w:r>
+              <w:rPr>
+                <w:b/>
+                <w:bCs/>
+              </w:rPr>
+              <w:t xml:space="preserve">Tier 1 </w:t>
+            </w:r>
+          </w:p>
+        </w:tc>
+        <w:tc>
+          <w:tcPr>
+            <w:tcW w:w="0" w:type="auto"/>
+            <w:vAlign w:val="center"/>
+            <w:hideMark/>
+          </w:tcPr>
+          <w:p>
+            <w:pPr>
+              <w:rPr>
+                <w:b/>
+                <w:bCs/>
+              </w:rPr>
+            </w:pPr>
+            <w:r>
+              <w:rPr>
+                <w:b/>
+                <w:bCs/>
+              </w:rPr>
+              <w:t xml:space="preserve">Tier 2 </w:t>
+            </w:r>
+          </w:p>
+        </w:tc>
+        <w:tc>
+          <w:tcPr>
+            <w:tcW w:w="0" w:type="auto"/>
+            <w:vAlign w:val="center"/>
+            <w:hideMark/>
+          </w:tcPr>
+          <w:p>
+            <w:pPr>
+              <w:rPr>
+                <w:b/>
+                <w:bCs/>
+              </w:rPr>
+            </w:pPr>
+            <w:r>
+              <w:rPr>
+                <w:b/>
+                <w:bCs/>
+              </w:rPr>
+              <w:t>Tier 3</w:t>
+            </w:r>
+          </w:p>
+        </w:tc>
+      </w:tr>
+      <w:tr>
+        <w:trPr>
+          <w:tblCellSpacing w:w="15" w:type="dxa"/>
+        </w:trPr>
+        <w:tc>
+          <w:tcPr>
+            <w:tcW w:w="0" w:type="auto"/>
+            <w:vAlign w:val="center"/>
+            <w:hideMark/>
+          </w:tcPr>
+          <w:p>
+            <w:pPr>
+              <w:rPr>
+                <w:b/>
+                <w:bCs/>
+              </w:rPr>
+            </w:pPr>
+            <w:r>
+              <w:rPr>
+                <w:b/>
+                <w:bCs/>
+              </w:rPr>
+              <w:t>Early Game</w:t>
+            </w:r>
+          </w:p>
+        </w:tc>
+        <w:tc>
+          <w:tcPr>
+            <w:tcW w:w="0" w:type="auto"/>
+            <w:vAlign w:val="center"/>
+            <w:hideMark/>
+          </w:tcPr>
+          <w:p>
+            <w:pPr>
+              <w:rPr>
+                <w:b/>
+                <w:bCs/>
+              </w:rPr>
+            </w:pPr>
+            <w:r>
+              <w:rPr>
+                <w:b/>
+                <w:bCs/>
+              </w:rPr>
+              <w:t>65%</w:t>
+            </w:r>
+          </w:p>
+        </w:tc>
+        <w:tc>
+          <w:tcPr>
+            <w:tcW w:w="0" w:type="auto"/>
+            <w:vAlign w:val="center"/>
+            <w:hideMark/>
+          </w:tcPr>
+          <w:p>
+            <w:pPr>
+              <w:rPr>
+                <w:b/>
+                <w:bCs/>
+              </w:rPr>
+            </w:pPr>
+            <w:r>
+              <w:rPr>
+                <w:b/>
+                <w:bCs/>
+              </w:rPr>
+              <w:t>30%</w:t>
+            </w:r>
+          </w:p>
+        </w:tc>
+        <w:tc>
+          <w:tcPr>
+            <w:tcW w:w="0" w:type="auto"/>
+            <w:vAlign w:val="center"/>
+            <w:hideMark/>
+          </w:tcPr>
+          <w:p>
+            <w:pPr>
+              <w:rPr>
+                <w:b/>
+                <w:bCs/>
+              </w:rPr>
+            </w:pPr>
+            <w:r>
+              <w:rPr>
+                <w:b/>
+                <w:bCs/>
+              </w:rPr>
+              <w:t>5%</w:t>
+            </w:r>
+          </w:p>
+        </w:tc>
+        <w:tc>
+          <w:tcPr>
+            <w:tcW w:w="0" w:type="auto"/>
+            <w:vAlign w:val="center"/>
+            <w:hideMark/>
+          </w:tcPr>
+          <w:p>
+            <w:pPr>
+              <w:rPr>
+                <w:b/>
+                <w:bCs/>
+              </w:rPr>
+            </w:pPr>
+            <w:r>
+              <w:rPr>
+                <w:b/>
+                <w:bCs/>
+              </w:rPr>
+              <w:t>0%</w:t>
+            </w:r>
+          </w:p>
+        </w:tc>
+      </w:tr>
+      <w:tr>
+        <w:trPr>
+          <w:tblCellSpacing w:w="15" w:type="dxa"/>
+        </w:trPr>
+        <w:tc>
+          <w:tcPr>
+            <w:tcW w:w="0" w:type="auto"/>
+            <w:vAlign w:val="center"/>
+            <w:hideMark/>
+          </w:tcPr>
+          <w:p>
+            <w:pPr>
+              <w:rPr>
+                <w:b/>
+                <w:bCs/>
+              </w:rPr>
+            </w:pPr>
+            <w:r>
+              <w:rPr>
+                <w:b/>
+                <w:bCs/>
+              </w:rPr>
+              <w:t>Mid Game</w:t>
+            </w:r>
+          </w:p>
+        </w:tc>
+        <w:tc>
+          <w:tcPr>
+            <w:tcW w:w="0" w:type="auto"/>
+            <w:vAlign w:val="center"/>
+            <w:hideMark/>
+          </w:tcPr>
+          <w:p>
+            <w:pPr>
+              <w:rPr>
+                <w:b/>
+                <w:bCs/>
+              </w:rPr>
+            </w:pPr>
+            <w:r>
+              <w:rPr>
+                <w:b/>
+                <w:bCs/>
+              </w:rPr>
+              <w:t>35%</w:t>
+            </w:r>
+          </w:p>
+        </w:tc>
+        <w:tc>
+          <w:tcPr>
+            <w:tcW w:w="0" w:type="auto"/>
+            <w:vAlign w:val="center"/>
+            <w:hideMark/>
+          </w:tcPr>
+          <w:p>
+            <w:pPr>
+              <w:rPr>
+                <w:b/>
+                <w:bCs/>
+              </w:rPr>
+            </w:pPr>
+            <w:r>
+              <w:rPr>
+                <w:b/>
+                <w:bCs/>
+              </w:rPr>
+              <w:t>40%</w:t>
+            </w:r>
+          </w:p>
+        </w:tc>
+        <w:tc>
+          <w:tcPr>
+            <w:tcW w:w="0" w:type="auto"/>
+            <w:vAlign w:val="center"/>
+            <w:hideMark/>
+          </w:tcPr>
+          <w:p>
+            <w:pPr>
+              <w:rPr>
+                <w:b/>
+                <w:bCs/>
+              </w:rPr>
+            </w:pPr>
+            <w:r>
+              <w:rPr>
+                <w:b/>
+                <w:bCs/>
+              </w:rPr>
+              <w:t>25%</w:t>
+            </w:r>
+          </w:p>
+        </w:tc>
+        <w:tc>
+          <w:tcPr>
+            <w:tcW w:w="0" w:type="auto"/>
+            <w:vAlign w:val="center"/>
+            <w:hideMark/>
+          </w:tcPr>
+          <w:p>
+            <w:pPr>
+              <w:rPr>
+                <w:b/>
+                <w:bCs/>
+              </w:rPr>
+            </w:pPr>
+            <w:r>
+              <w:rPr>
+                <w:b/>
+                <w:bCs/>
+              </w:rPr>
+              <w:t>0%</w:t>
+            </w:r>
+          </w:p>
+        </w:tc>
+      </w:tr>
+      <w:tr>
+        <w:trPr>
+          <w:tblCellSpacing w:w="15" w:type="dxa"/>
+        </w:trPr>
+        <w:tc>
+          <w:tcPr>
+            <w:tcW w:w="0" w:type="auto"/>
+            <w:vAlign w:val="center"/>
+            <w:hideMark/>
+          </w:tcPr>
+          <w:p>
+            <w:pPr>
+              <w:rPr>
+                <w:b/>
+                <w:bCs/>
+              </w:rPr>
+            </w:pPr>
+            <w:r>
+              <w:rPr>
+                <w:b/>
+                <w:bCs/>
+              </w:rPr>
+              <w:t>Late Game</w:t>
+            </w:r>
+          </w:p>
+        </w:tc>
+        <w:tc>
+          <w:tcPr>
+            <w:tcW w:w="0" w:type="auto"/>
+            <w:vAlign w:val="center"/>
+            <w:hideMark/>
+          </w:tcPr>
+          <w:p>
+            <w:pPr>
+              <w:rPr>
+                <w:b/>
+                <w:bCs/>
+              </w:rPr>
+            </w:pPr>
+            <w:r>
+              <w:rPr>
+                <w:b/>
+                <w:bCs/>
+              </w:rPr>
+              <w:t>15%</w:t>
+            </w:r>
+          </w:p>
+        </w:tc>
+        <w:tc>
+          <w:tcPr>
+            <w:tcW w:w="0" w:type="auto"/>
+            <w:vAlign w:val="center"/>
+            <w:hideMark/>
+          </w:tcPr>
+          <w:p>
+            <w:pPr>
+              <w:rPr>
+                <w:b/>
+                <w:bCs/>
+              </w:rPr>
+            </w:pPr>
+            <w:r>
+              <w:rPr>
+                <w:b/>
+                <w:bCs/>
+              </w:rPr>
+              <w:t>25%</w:t>
+            </w:r>
+          </w:p>
+        </w:tc>
+        <w:tc>
+          <w:tcPr>
+            <w:tcW w:w="0" w:type="auto"/>
+            <w:vAlign w:val="center"/>
+            <w:hideMark/>
+          </w:tcPr>
+          <w:p>
+            <w:pPr>
+              <w:rPr>
+                <w:b/>
+                <w:bCs/>
+              </w:rPr>
+            </w:pPr>
+            <w:r>
+              <w:rPr>
+                <w:b/>
+                <w:bCs/>
+              </w:rPr>
+              <w:t>35%</w:t>
+            </w:r>
+          </w:p>
+        </w:tc>
+        <w:tc>
+          <w:tcPr>
+            <w:tcW w:w="0" w:type="auto"/>
+            <w:vAlign w:val="center"/>
+            <w:hideMark/>
+          </w:tcPr>
+          <w:p>
+            <w:pPr>
+              <w:rPr>
+                <w:b/>
+                <w:bCs/>
+              </w:rPr>
+            </w:pPr>
+          </w:p>
+        </w:tc>
+      </w:tr>
+    </w:tbl>
+    <w:p>
+      <w:pPr>
+        <w:rPr>
+          <w:b/>
+          <w:bCs/>
+        </w:rPr>
+      </w:pPr>
+    </w:p>
+    <w:p>
+      <w:pPr>
+        <w:rPr>
+          <w:b/>
+          <w:bCs/>
+        </w:rPr>
+      </w:pPr>
+      <w:r>
+        <w:rPr>
+          <w:b/>
+          <w:bCs/>
+        </w:rPr>
+        <w:t>2. Card Upgrade Quantity Odds</w:t>
+      </w:r>
+    </w:p>
+    <w:p>
+      <w:pPr>
+        <w:rPr>
+          <w:b/>
+          <w:bCs/>
+        </w:rPr>
+      </w:pPr>
+      <w:r>
+        <w:rPr>
+          <w:b/>
+          <w:bCs/>
+        </w:rPr>
+        <w:t>This determines how many total card slots in the starter deck will be selected for mutation/upgrades:</w:t>
+      </w:r>
+    </w:p>
+    <w:tbl>
+      <w:tblPr>
+        <w:tblW w:w="0" w:type="auto"/>
+        <w:tblCellSpacing w:w="15" w:type="dxa"/>
+        <w:tblCellMar>
+          <w:top w:w="15" w:type="dxa"/>
+          <w:left w:w="15" w:type="dxa"/>
+          <w:bottom w:w="15" w:type="dxa"/>
+          <w:right w:w="15" w:type="dxa"/>
+        </w:tblCellMar>
+        <w:tblLook w:val="04A0" w:firstRow="1" w:lastRow="0" w:firstColumn="1" w:lastColumn="0" w:noHBand="0" w:noVBand="1"/>
+      </w:tblPr>
+      <w:tblGrid>
+        <w:gridCol w:w="1390"/>
+        <w:gridCol w:w="815"/>
+        <w:gridCol w:w="890"/>
+        <w:gridCol w:w="890"/>
+        <w:gridCol w:w="890"/>
+        <w:gridCol w:w="905"/>
+      </w:tblGrid>
+      <w:tr>
+        <w:trPr>
+          <w:tblHeader/>
+          <w:tblCellSpacing w:w="15" w:type="dxa"/>
+        </w:trPr>
+        <w:tc>
+          <w:tcPr>
+            <w:tcW w:w="0" w:type="auto"/>
+            <w:vAlign w:val="center"/>
+            <w:hideMark/>
+          </w:tcPr>
+          <w:p>
+            <w:pPr>
+              <w:rPr>
+                <w:b/>
+                <w:bCs/>
+              </w:rPr>
+            </w:pPr>
+            <w:r>
+              <w:rPr>
+                <w:b/>
+                <w:bCs/>
+              </w:rPr>
+              <w:t>Game Stage</w:t>
+            </w:r>
+          </w:p>
+        </w:tc>
+        <w:tc>
+          <w:tcPr>
+            <w:tcW w:w="0" w:type="auto"/>
+            <w:vAlign w:val="center"/>
+            <w:hideMark/>
+          </w:tcPr>
+          <w:p>
+            <w:pPr>
+              <w:rPr>
+                <w:b/>
+                <w:bCs/>
+              </w:rPr>
+            </w:pPr>
+            <w:r>
+              <w:rPr>
+                <w:b/>
+                <w:bCs/>
+              </w:rPr>
+              <w:t xml:space="preserve"> </w:t>
+            </w:r>
+            <w:r>
+              <w:rPr>
+                <w:b/>
+                <w:bCs/>
+              </w:rPr>
+              <w:t>1 Card</w:t>
+            </w:r>
+          </w:p>
+        </w:tc>
+        <w:tc>
+          <w:tcPr>
+            <w:tcW w:w="0" w:type="auto"/>
+            <w:vAlign w:val="center"/>
+            <w:hideMark/>
+          </w:tcPr>
+          <w:p>
+            <w:pPr>
+              <w:rPr>
+                <w:b/>
+                <w:bCs/>
+              </w:rPr>
+            </w:pPr>
+            <w:r>
+              <w:rPr>
+                <w:b/>
+                <w:bCs/>
+              </w:rPr>
+              <w:t>2 Cards</w:t>
+            </w:r>
+          </w:p>
+        </w:tc>
+        <w:tc>
+          <w:tcPr>
+            <w:tcW w:w="0" w:type="auto"/>
+            <w:vAlign w:val="center"/>
+            <w:hideMark/>
+          </w:tcPr>
+          <w:p>
+            <w:pPr>
+              <w:rPr>
+                <w:b/>
+                <w:bCs/>
+              </w:rPr>
+            </w:pPr>
+            <w:r>
+              <w:rPr>
+                <w:b/>
+                <w:bCs/>
+              </w:rPr>
+              <w:t>3 Cards</w:t>
+            </w:r>
+          </w:p>
+        </w:tc>
+        <w:tc>
+          <w:tcPr>
+            <w:tcW w:w="0" w:type="auto"/>
+            <w:vAlign w:val="center"/>
+            <w:hideMark/>
+          </w:tcPr>
+          <w:p>
+            <w:pPr>
+              <w:rPr>
+                <w:b/>
+                <w:bCs/>
+              </w:rPr>
+            </w:pPr>
+            <w:r>
+              <w:rPr>
+                <w:b/>
+                <w:bCs/>
+              </w:rPr>
+              <w:t>4 Cards</w:t>
+            </w:r>
+          </w:p>
+        </w:tc>
+        <w:tc>
+          <w:tcPr>
+            <w:tcW w:w="0" w:type="auto"/>
+            <w:vAlign w:val="center"/>
+            <w:hideMark/>
+          </w:tcPr>
+          <w:p>
+            <w:pPr>
+              <w:rPr>
+                <w:b/>
+                <w:bCs/>
+              </w:rPr>
+            </w:pPr>
+            <w:r>
+              <w:rPr>
+                <w:b/>
+                <w:bCs/>
+              </w:rPr>
+              <w:t>5 Cards</w:t>
+            </w:r>
+          </w:p>
+        </w:tc>
+      </w:tr>
+      <w:tr>
+        <w:trPr>
+          <w:tblCellSpacing w:w="15" w:type="dxa"/>
+        </w:trPr>
+        <w:tc>
+          <w:tcPr>
+            <w:tcW w:w="0" w:type="auto"/>
+            <w:vAlign w:val="center"/>
+            <w:hideMark/>
+          </w:tcPr>
+          <w:p>
+            <w:pPr>
+              <w:rPr>
+                <w:b/>
+                <w:bCs/>
+              </w:rPr>
+            </w:pPr>
+            <w:r>
+              <w:rPr>
+                <w:b/>
+                <w:bCs/>
+              </w:rPr>
+              <w:t>Early Game</w:t>
+            </w:r>
+          </w:p>
+        </w:tc>
+        <w:tc>
+          <w:tcPr>
+            <w:tcW w:w="0" w:type="auto"/>
+            <w:vAlign w:val="center"/>
+            <w:hideMark/>
+          </w:tcPr>
+          <w:p>
+            <w:pPr>
+              <w:rPr>
+                <w:b/>
+                <w:bCs/>
+              </w:rPr>
+            </w:pPr>
+            <w:r>
+              <w:rPr>
+                <w:b/>
+                <w:bCs/>
+              </w:rPr>
+              <w:t xml:space="preserve"> </w:t>
+            </w:r>
+            <w:r>
+              <w:rPr>
+                <w:b/>
+                <w:bCs/>
+              </w:rPr>
+              <w:t>30%</w:t>
+            </w:r>
+          </w:p>
+        </w:tc>
+        <w:tc>
+          <w:tcPr>
+            <w:tcW w:w="0" w:type="auto"/>
+            <w:vAlign w:val="center"/>
+            <w:hideMark/>
+          </w:tcPr>
+          <w:p>
+            <w:pPr>
+              <w:rPr>
+                <w:b/>
+                <w:bCs/>
+              </w:rPr>
+            </w:pPr>
+            <w:r>
+              <w:rPr>
+                <w:b/>
+                <w:bCs/>
+              </w:rPr>
+              <w:t>50%</w:t>
+            </w:r>
+          </w:p>
+        </w:tc>
+        <w:tc>
+          <w:tcPr>
+            <w:tcW w:w="0" w:type="auto"/>
+            <w:vAlign w:val="center"/>
+            <w:hideMark/>
+          </w:tcPr>
+          <w:p>
+            <w:pPr>
+              <w:rPr>
+                <w:b/>
+                <w:bCs/>
+              </w:rPr>
+            </w:pPr>
+            <w:r>
+              <w:rPr>
+                <w:b/>
+                <w:bCs/>
+              </w:rPr>
+              <w:t>20%</w:t>
+            </w:r>
+          </w:p>
+        </w:tc>
+        <w:tc>
+          <w:tcPr>
+            <w:tcW w:w="0" w:type="auto"/>
+            <w:vAlign w:val="center"/>
+            <w:hideMark/>
+          </w:tcPr>
+          <w:p>
+            <w:pPr>
+              <w:rPr>
+                <w:b/>
+                <w:bCs/>
+              </w:rPr>
+            </w:pPr>
+            <w:r>
+              <w:rPr>
+                <w:b/>
+                <w:bCs/>
+              </w:rPr>
+              <w:t>0%</w:t>
+            </w:r>
+          </w:p>
+        </w:tc>
+        <w:tc>
+          <w:tcPr>
+            <w:tcW w:w="0" w:type="auto"/>
+            <w:vAlign w:val="center"/>
+            <w:hideMark/>
+          </w:tcPr>
+          <w:p>
+            <w:pPr>
+              <w:rPr>
+                <w:b/>
+                <w:bCs/>
+              </w:rPr>
+            </w:pPr>
+            <w:r>
+              <w:rPr>
+                <w:b/>
+                <w:bCs/>
+              </w:rPr>
+              <w:t>0%</w:t>
+            </w:r>
+          </w:p>
+        </w:tc>
+      </w:tr>
+      <w:tr>
+        <w:trPr>
+          <w:tblCellSpacing w:w="15" w:type="dxa"/>
+        </w:trPr>
+        <w:tc>
+          <w:tcPr>
+            <w:tcW w:w="0" w:type="auto"/>
+            <w:vAlign w:val="center"/>
+            <w:hideMark/>
+          </w:tcPr>
+          <w:p>
+            <w:pPr>
+              <w:rPr>
+                <w:b/>
+                <w:bCs/>
+              </w:rPr>
+            </w:pPr>
+            <w:r>
+              <w:rPr>
+                <w:b/>
+                <w:bCs/>
+              </w:rPr>
+              <w:t>Mid Game</w:t>
+            </w:r>
+          </w:p>
+        </w:tc>
+        <w:tc>
+          <w:tcPr>
+            <w:tcW w:w="0" w:type="auto"/>
+            <w:vAlign w:val="center"/>
+            <w:hideMark/>
+          </w:tcPr>
+          <w:p>
+            <w:pPr>
+              <w:rPr>
+                <w:b/>
+                <w:bCs/>
+              </w:rPr>
+            </w:pPr>
+            <w:r>
+              <w:rPr>
+                <w:b/>
+                <w:bCs/>
+              </w:rPr>
+              <w:t xml:space="preserve"> </w:t>
+            </w:r>
+            <w:r>
+              <w:rPr>
+                <w:b/>
+                <w:bCs/>
+              </w:rPr>
+              <w:t>0%</w:t>
+            </w:r>
+          </w:p>
+        </w:tc>
+        <w:tc>
+          <w:tcPr>
+            <w:tcW w:w="0" w:type="auto"/>
+            <w:vAlign w:val="center"/>
+            <w:hideMark/>
+          </w:tcPr>
+          <w:p>
+            <w:pPr>
+              <w:rPr>
+                <w:b/>
+                <w:bCs/>
+              </w:rPr>
+            </w:pPr>
+            <w:r>
+              <w:rPr>
+                <w:b/>
+                <w:bCs/>
+              </w:rPr>
+              <w:t>0%</w:t>
+            </w:r>
+          </w:p>
+        </w:tc>
+        <w:tc>
+          <w:tcPr>
+            <w:tcW w:w="0" w:type="auto"/>
+            <w:vAlign w:val="center"/>
+            <w:hideMark/>
+          </w:tcPr>
+          <w:p>
+            <w:pPr>
+              <w:rPr>
+                <w:b/>
+                <w:bCs/>
+              </w:rPr>
+            </w:pPr>
+            <w:r>
+              <w:rPr>
+                <w:b/>
+                <w:bCs/>
+              </w:rPr>
+              <w:t>50%</w:t>
+            </w:r>
+          </w:p>
+        </w:tc>
+        <w:tc>
+          <w:tcPr>
+            <w:tcW w:w="0" w:type="auto"/>
+            <w:vAlign w:val="center"/>
+            <w:hideMark/>
+          </w:tcPr>
+          <w:p>
+            <w:pPr>
+              <w:rPr>
+                <w:b/>
+                <w:bCs/>
+              </w:rPr>
+            </w:pPr>
+            <w:r>
+              <w:rPr>
+                <w:b/>
+                <w:bCs/>
+              </w:rPr>
+              <w:t>50%</w:t>
+            </w:r>
+          </w:p>
+        </w:tc>
+        <w:tc>
+          <w:tcPr>
+            <w:tcW w:w="0" w:type="auto"/>
+            <w:vAlign w:val="center"/>
+            <w:hideMark/>
+          </w:tcPr>
+          <w:p>
+            <w:pPr>
+              <w:rPr>
+                <w:b/>
+                <w:bCs/>
+              </w:rPr>
+            </w:pPr>
+            <w:r>
+              <w:rPr>
+                <w:b/>
+                <w:bCs/>
+              </w:rPr>
+              <w:t>0%</w:t>
+            </w:r>
+          </w:p>
+        </w:tc>
+      </w:tr>
+      <w:tr>
+        <w:trPr>
+          <w:tblCellSpacing w:w="15" w:type="dxa"/>
+        </w:trPr>
+        <w:tc>
+          <w:tcPr>
+            <w:tcW w:w="0" w:type="auto"/>
+            <w:vAlign w:val="center"/>
+            <w:hideMark/>
+          </w:tcPr>
+          <w:p>
+            <w:pPr>
+              <w:rPr>
+                <w:b/>
+                <w:bCs/>
+              </w:rPr>
+            </w:pPr>
+            <w:r>
+              <w:rPr>
+                <w:b/>
+                <w:bCs/>
+              </w:rPr>
+              <w:lastRenderedPageBreak/>
+              <w:t>Late Game</w:t>
+            </w:r>
+            <w:r>
+              <w:rPr>
+                <w:b/>
+                <w:bCs/>
+              </w:rPr>
+              <w:t xml:space="preserve"> </w:t>
+            </w:r>
+          </w:p>
+        </w:tc>
+        <w:tc>
+          <w:tcPr>
+            <w:tcW w:w="0" w:type="auto"/>
+            <w:vAlign w:val="center"/>
+            <w:hideMark/>
+          </w:tcPr>
+          <w:p>
+            <w:pPr>
+              <w:rPr>
+                <w:b/>
+                <w:bCs/>
+              </w:rPr>
+            </w:pPr>
+            <w:r>
+              <w:rPr>
+                <w:b/>
+                <w:bCs/>
+              </w:rPr>
+              <w:t xml:space="preserve"> </w:t>
+            </w:r>
+            <w:r>
+              <w:rPr>
+                <w:b/>
+                <w:bCs/>
+              </w:rPr>
+              <w:t>0%</w:t>
+            </w:r>
+          </w:p>
+        </w:tc>
+        <w:tc>
+          <w:tcPr>
+            <w:tcW w:w="0" w:type="auto"/>
+            <w:vAlign w:val="center"/>
+            <w:hideMark/>
+          </w:tcPr>
+          <w:p>
+            <w:pPr>
+              <w:rPr>
+                <w:b/>
+                <w:bCs/>
+              </w:rPr>
+            </w:pPr>
+            <w:r>
+              <w:rPr>
+                <w:b/>
+                <w:bCs/>
+              </w:rPr>
+              <w:t>0%</w:t>
+            </w:r>
+          </w:p>
+        </w:tc>
+        <w:tc>
+          <w:tcPr>
+            <w:tcW w:w="0" w:type="auto"/>
+            <w:vAlign w:val="center"/>
+            <w:hideMark/>
+          </w:tcPr>
+          <w:p>
+            <w:pPr>
+              <w:rPr>
+                <w:b/>
+                <w:bCs/>
+              </w:rPr>
+            </w:pPr>
+            <w:r>
+              <w:rPr>
+                <w:b/>
+                <w:bCs/>
+              </w:rPr>
+              <w:t>0%</w:t>
+            </w:r>
+          </w:p>
+        </w:tc>
+        <w:tc>
+          <w:tcPr>
+            <w:tcW w:w="0" w:type="auto"/>
+            <w:vAlign w:val="center"/>
+            <w:hideMark/>
+          </w:tcPr>
+          <w:p>
+            <w:pPr>
+              <w:rPr>
+                <w:b/>
+                <w:bCs/>
+              </w:rPr>
+            </w:pPr>
+            <w:r>
+              <w:rPr>
+                <w:b/>
+                <w:bCs/>
+              </w:rPr>
+              <w:t xml:space="preserve">80%         </w:t>
+            </w:r>
+          </w:p>
+        </w:tc>
+        <w:tc>
+          <w:tcPr>
+            <w:tcW w:w="0" w:type="auto"/>
+            <w:vAlign w:val="center"/>
+            <w:hideMark/>
+          </w:tcPr>
+          <w:p>
+            <w:pPr>
+              <w:rPr>
+                <w:b/>
+                <w:bCs/>
+              </w:rPr>
+            </w:pPr>
+            <w:r>
+              <w:rPr>
+                <w:b/>
+                <w:bCs/>
+              </w:rPr>
+              <w:t>20%</w:t>
+            </w:r>
+          </w:p>
+        </w:tc>
+      </w:tr>
+    </w:tbl>
+    <w:p>
+      <w:pPr>
+        <w:rPr>
+          <w:b/>
+          <w:bCs/>
+        </w:rPr>
+      </w:pPr>
+    </w:p>
+    <w:p>
+      <w:pPr>
+        <w:rPr>
+          <w:b/>
+          <w:bCs/>
+        </w:rPr>
+      </w:pPr>
+      <w:r>
+        <w:rPr>
+          <w:b/>
+          <w:bCs/>
+        </w:rPr>
+        <w:t>3. Card Upgrade Quality Tiers</w:t>
+      </w:r>
+    </w:p>
+    <w:p>
+      <w:pPr>
+        <w:rPr>
+          <w:b/>
+          <w:bCs/>
+        </w:rPr>
+      </w:pPr>
+      <w:r>
+        <w:rPr>
+          <w:b/>
+          <w:bCs/>
+        </w:rPr>
+        <w:t xml:space="preserve">Once the engine knows </w:t>
+      </w:r>
+      <w:r>
+        <w:rPr>
+          <w:b/>
+          <w:bCs/>
+          <w:i/>
+          <w:iCs/>
+        </w:rPr>
+        <w:t>how many</w:t>
+      </w:r>
+      <w:r>
+        <w:rPr>
+          <w:b/>
+          <w:bCs/>
+        </w:rPr>
+        <w:t xml:space="preserve"> cards it is upgrading, it rolls against these percentages to see which upgrade pool those cards are pulled from:</w:t>
+      </w:r>
+    </w:p>
+    <w:tbl>
+      <w:tblPr>
+        <w:tblW w:w="0" w:type="auto"/>
+        <w:tblCellSpacing w:w="15" w:type="dxa"/>
+        <w:tblCellMar>
+          <w:top w:w="15" w:type="dxa"/>
+          <w:left w:w="15" w:type="dxa"/>
+          <w:bottom w:w="15" w:type="dxa"/>
+          <w:right w:w="15" w:type="dxa"/>
+        </w:tblCellMar>
+        <w:tblLook w:val="04A0" w:firstRow="1" w:lastRow="0" w:firstColumn="1" w:lastColumn="0" w:noHBand="0" w:noVBand="1"/>
+      </w:tblPr>
+      <w:tblGrid>
+        <w:gridCol w:w="1390"/>
+        <w:gridCol w:w="768"/>
+        <w:gridCol w:w="865"/>
+        <w:gridCol w:w="831"/>
+      </w:tblGrid>
+      <w:tr>
+        <w:trPr>
+          <w:tblHeader/>
+          <w:tblCellSpacing w:w="15" w:type="dxa"/>
+        </w:trPr>
+        <w:tc>
+          <w:tcPr>
+            <w:tcW w:w="0" w:type="auto"/>
+            <w:vAlign w:val="center"/>
+            <w:hideMark/>
+          </w:tcPr>
+          <w:p>
+            <w:pPr>
+              <w:rPr>
+                <w:b/>
+                <w:bCs/>
+              </w:rPr>
+            </w:pPr>
+            <w:r>
+              <w:rPr>
+                <w:b/>
+                <w:bCs/>
+              </w:rPr>
+              <w:t>Game Stage</w:t>
+            </w:r>
+          </w:p>
+        </w:tc>
+        <w:tc>
+          <w:tcPr>
+            <w:tcW w:w="0" w:type="auto"/>
+            <w:vAlign w:val="center"/>
+            <w:hideMark/>
+          </w:tcPr>
+          <w:p>
+            <w:pPr>
+              <w:rPr>
+                <w:b/>
+                <w:bCs/>
+              </w:rPr>
+            </w:pPr>
+            <w:r>
+              <w:rPr>
+                <w:b/>
+                <w:bCs/>
+              </w:rPr>
+              <w:t xml:space="preserve"> </w:t>
+            </w:r>
+            <w:r>
+              <w:rPr>
+                <w:b/>
+                <w:bCs/>
+              </w:rPr>
+              <w:t xml:space="preserve">Tier 0 </w:t>
+            </w:r>
+            <w:r>
+              <w:rPr>
+                <w:b/>
+                <w:bCs/>
+              </w:rPr>
+              <w:t xml:space="preserve"> </w:t>
+            </w:r>
+          </w:p>
+        </w:tc>
+        <w:tc>
+          <w:tcPr>
+            <w:tcW w:w="0" w:type="auto"/>
+            <w:vAlign w:val="center"/>
+            <w:hideMark/>
+          </w:tcPr>
+          <w:p>
+            <w:pPr>
+              <w:rPr>
+                <w:b/>
+                <w:bCs/>
+              </w:rPr>
+            </w:pPr>
+            <w:r>
+              <w:rPr>
+                <w:b/>
+                <w:bCs/>
+              </w:rPr>
+              <w:t xml:space="preserve">  </w:t>
+            </w:r>
+            <w:r>
+              <w:rPr>
+                <w:b/>
+                <w:bCs/>
+              </w:rPr>
+              <w:t>Tier 2</w:t>
+            </w:r>
+          </w:p>
+        </w:tc>
+        <w:tc>
+          <w:tcPr>
+            <w:tcW w:w="0" w:type="auto"/>
+            <w:vAlign w:val="center"/>
+            <w:hideMark/>
+          </w:tcPr>
+          <w:p>
+            <w:pPr>
+              <w:rPr>
+                <w:b/>
+                <w:bCs/>
+              </w:rPr>
+            </w:pPr>
+            <w:r>
+              <w:rPr>
+                <w:b/>
+                <w:bCs/>
+              </w:rPr>
+              <w:t xml:space="preserve">  </w:t>
+            </w:r>
+            <w:r>
+              <w:rPr>
+                <w:b/>
+                <w:bCs/>
+              </w:rPr>
+              <w:t>Tier 3</w:t>
+            </w:r>
+          </w:p>
+        </w:tc>
+      </w:tr>
+      <w:tr>
+        <w:trPr>
+          <w:tblCellSpacing w:w="15" w:type="dxa"/>
+        </w:trPr>
+        <w:tc>
+          <w:tcPr>
+            <w:tcW w:w="0" w:type="auto"/>
+            <w:vAlign w:val="center"/>
+            <w:hideMark/>
+          </w:tcPr>
+          <w:p>
+            <w:pPr>
+              <w:rPr>
+                <w:b/>
+                <w:bCs/>
+              </w:rPr>
+            </w:pPr>
+            <w:r>
+              <w:rPr>
+                <w:b/>
+                <w:bCs/>
+              </w:rPr>
+              <w:t>Early Game</w:t>
+            </w:r>
+          </w:p>
+        </w:tc>
+        <w:tc>
+          <w:tcPr>
+            <w:tcW w:w="0" w:type="auto"/>
+            <w:vAlign w:val="center"/>
+            <w:hideMark/>
+          </w:tcPr>
+          <w:p>
+            <w:pPr>
+              <w:rPr>
+                <w:b/>
+                <w:bCs/>
+              </w:rPr>
+            </w:pPr>
+            <w:r>
+              <w:rPr>
+                <w:b/>
+                <w:bCs/>
+              </w:rPr>
+              <w:t xml:space="preserve"> </w:t>
+            </w:r>
+            <w:r>
+              <w:rPr>
+                <w:b/>
+                <w:bCs/>
+              </w:rPr>
+              <w:t>100%</w:t>
+            </w:r>
+          </w:p>
+        </w:tc>
+        <w:tc>
+          <w:tcPr>
+            <w:tcW w:w="0" w:type="auto"/>
+            <w:vAlign w:val="center"/>
+            <w:hideMark/>
+          </w:tcPr>
+          <w:p>
+            <w:pPr>
+              <w:rPr>
+                <w:b/>
+                <w:bCs/>
+              </w:rPr>
+            </w:pPr>
+            <w:r>
+              <w:rPr>
+                <w:b/>
+                <w:bCs/>
+              </w:rPr>
+              <w:t xml:space="preserve">   </w:t>
+            </w:r>
+            <w:r>
+              <w:rPr>
+                <w:b/>
+                <w:bCs/>
+              </w:rPr>
+              <w:t>0%</w:t>
+            </w:r>
+          </w:p>
+        </w:tc>
+        <w:tc>
+          <w:tcPr>
+            <w:tcW w:w="0" w:type="auto"/>
+            <w:vAlign w:val="center"/>
+            <w:hideMark/>
+          </w:tcPr>
+          <w:p>
+            <w:pPr>
+              <w:rPr>
+                <w:b/>
+                <w:bCs/>
+              </w:rPr>
+            </w:pPr>
+            <w:r>
+              <w:rPr>
+                <w:b/>
+                <w:bCs/>
+              </w:rPr>
+              <w:t xml:space="preserve">  </w:t>
+            </w:r>
+            <w:r>
+              <w:rPr>
+                <w:b/>
+                <w:bCs/>
+              </w:rPr>
+              <w:t>0%</w:t>
+            </w:r>
+          </w:p>
+        </w:tc>
+      </w:tr>
+      <w:tr>
+        <w:trPr>
+          <w:tblCellSpacing w:w="15" w:type="dxa"/>
+        </w:trPr>
+        <w:tc>
+          <w:tcPr>
+            <w:tcW w:w="0" w:type="auto"/>
+            <w:vAlign w:val="center"/>
+            <w:hideMark/>
+          </w:tcPr>
+          <w:p>
+            <w:pPr>
+              <w:rPr>
+                <w:b/>
+                <w:bCs/>
+              </w:rPr>
+            </w:pPr>
+            <w:r>
+              <w:rPr>
+                <w:b/>
+                <w:bCs/>
+              </w:rPr>
+              <w:t>Mid Game</w:t>
+            </w:r>
+          </w:p>
+        </w:tc>
+        <w:tc>
+          <w:tcPr>
+            <w:tcW w:w="0" w:type="auto"/>
+            <w:vAlign w:val="center"/>
+            <w:hideMark/>
+          </w:tcPr>
+          <w:p>
+            <w:pPr>
+              <w:rPr>
+                <w:b/>
+                <w:bCs/>
+              </w:rPr>
+            </w:pPr>
+            <w:r>
+              <w:rPr>
+                <w:b/>
+                <w:bCs/>
+              </w:rPr>
+              <w:t xml:space="preserve"> </w:t>
+            </w:r>
+            <w:r>
+              <w:rPr>
+                <w:b/>
+                <w:bCs/>
+              </w:rPr>
+              <w:t>57.1%</w:t>
+            </w:r>
+          </w:p>
+        </w:tc>
+        <w:tc>
+          <w:tcPr>
+            <w:tcW w:w="0" w:type="auto"/>
+            <w:vAlign w:val="center"/>
+            <w:hideMark/>
+          </w:tcPr>
+          <w:p>
+            <w:pPr>
+              <w:rPr>
+                <w:b/>
+                <w:bCs/>
+              </w:rPr>
+            </w:pPr>
+            <w:r>
+              <w:rPr>
+                <w:b/>
+                <w:bCs/>
+              </w:rPr>
+              <w:t xml:space="preserve">   </w:t>
+            </w:r>
+            <w:r>
+              <w:rPr>
+                <w:b/>
+                <w:bCs/>
+              </w:rPr>
+              <w:t>42.9%</w:t>
+            </w:r>
+          </w:p>
+        </w:tc>
+        <w:tc>
+          <w:tcPr>
+            <w:tcW w:w="0" w:type="auto"/>
+            <w:vAlign w:val="center"/>
+            <w:hideMark/>
+          </w:tcPr>
+          <w:p>
+            <w:pPr>
+              <w:rPr>
+                <w:b/>
+                <w:bCs/>
+              </w:rPr>
+            </w:pPr>
+            <w:r>
+              <w:rPr>
+                <w:b/>
+                <w:bCs/>
+              </w:rPr>
+              <w:t xml:space="preserve">  </w:t>
+            </w:r>
+            <w:r>
+              <w:rPr>
+                <w:b/>
+                <w:bCs/>
+              </w:rPr>
+              <w:t>0%</w:t>
+            </w:r>
+          </w:p>
+        </w:tc>
+      </w:tr>
+      <w:tr>
+        <w:trPr>
+          <w:tblCellSpacing w:w="15" w:type="dxa"/>
+        </w:trPr>
+        <w:tc>
+          <w:tcPr>
+            <w:tcW w:w="0" w:type="auto"/>
+            <w:vAlign w:val="center"/>
+            <w:hideMark/>
+          </w:tcPr>
+          <w:p>
+            <w:pPr>
+              <w:rPr>
+                <w:b/>
+                <w:bCs/>
+              </w:rPr>
+            </w:pPr>
+            <w:r>
+              <w:rPr>
+                <w:b/>
+                <w:bCs/>
+              </w:rPr>
+              <w:t>Late Game</w:t>
+            </w:r>
+          </w:p>
+        </w:tc>
+        <w:tc>
+          <w:tcPr>
+            <w:tcW w:w="0" w:type="auto"/>
+            <w:vAlign w:val="center"/>
+            <w:hideMark/>
+          </w:tcPr>
+          <w:p>
+            <w:pPr>
+              <w:rPr>
+                <w:b/>
+                <w:bCs/>
+              </w:rPr>
+            </w:pPr>
+            <w:r>
+              <w:rPr>
+                <w:b/>
+                <w:bCs/>
+              </w:rPr>
+              <w:t xml:space="preserve"> </w:t>
+            </w:r>
+            <w:r>
+              <w:rPr>
+                <w:b/>
+                <w:bCs/>
+              </w:rPr>
+              <w:t>23.8%</w:t>
+            </w:r>
+          </w:p>
+        </w:tc>
+        <w:tc>
+          <w:tcPr>
+            <w:tcW w:w="0" w:type="auto"/>
+            <w:vAlign w:val="center"/>
+            <w:hideMark/>
+          </w:tcPr>
+          <w:p>
+            <w:pPr>
+              <w:rPr>
+                <w:b/>
+                <w:bCs/>
+              </w:rPr>
+            </w:pPr>
+            <w:r>
+              <w:rPr>
+                <w:b/>
+                <w:bCs/>
+              </w:rPr>
+              <w:t xml:space="preserve">   </w:t>
+            </w:r>
+            <w:r>
+              <w:rPr>
+                <w:b/>
+                <w:bCs/>
+              </w:rPr>
+              <w:t>47.6%</w:t>
+            </w:r>
+          </w:p>
+        </w:tc>
+        <w:tc>
+          <w:tcPr>
+            <w:tcW w:w="0" w:type="auto"/>
+            <w:vAlign w:val="center"/>
+            <w:hideMark/>
+          </w:tcPr>
+          <w:p>
+            <w:pPr>
+              <w:rPr>
+                <w:b/>
+                <w:bCs/>
+              </w:rPr>
+            </w:pPr>
+            <w:r>
+              <w:rPr>
+                <w:b/>
+                <w:bCs/>
+              </w:rPr>
+              <w:t xml:space="preserve">  </w:t>
+            </w:r>
+            <w:r>
+              <w:rPr>
+                <w:b/>
+                <w:bCs/>
+              </w:rPr>
+              <w:t>28.6%</w:t>
+            </w:r>
+          </w:p>
+        </w:tc>
+      </w:tr>
+    </w:tbl>
+    <w:p>
+      <w:pPr>
+        <w:rPr>
+          <w:b/>
+          <w:bCs/>
+        </w:rPr>
+      </w:pPr>
+    </w:p>
+    <w:p>
+      <w:pPr>
+        <w:rPr>
+          <w:b/>
+          <w:bCs/>
+        </w:rPr>
+      </w:pPr>
+      <w:r>
+        <w:rPr>
+          <w:b/>
+          <w:bCs/>
+        </w:rPr>
+        <w:t>Current possible weaknesses of the engine:</w:t>
+      </w:r>
+    </w:p>
+    <w:p>
+      <w:pPr>
+        <w:pStyle w:val="ListParagraph"/>
+        <w:numPr>
+          <w:ilvl w:val="0"/>
+          <w:numId w:val="1"/>
+        </w:numPr>
+      </w:pPr>
+      <w:r>
+        <w:t>Unit odds are equal among all factions. So swarmer factions will on average still have the same amount of units as in combat as all others.</w:t>
+      </w:r>
+    </w:p>
+    <w:p>
+      <w:pPr>
+        <w:rPr>
+          <w:b/>
+          <w:bCs/>
+        </w:rPr>
+      </w:pPr>
+    </w:p>
+    <w:p>
+      <w:pPr>
+        <w:rPr>
+          <w:b/>
+          <w:bCs/>
+        </w:rPr>
+      </w:pPr>
+    </w:p>
+    <w:p>
+      <w:pPr>
+        <w:rPr>
+          <w:b/>
+          <w:bCs/>
+        </w:rPr>
+      </w:pPr>
+      <w:r>
+        <w:rPr>
+          <w:b/>
+          <w:bCs/>
+        </w:rPr>
+        <w:t>CARDS:</w:t>
+      </w:r>
+    </w:p>
+    <w:p>
+      <w:pPr>
+        <w:rPr>
+          <w:b/>
+          <w:bCs/>
+        </w:rPr>
+      </w:pPr>
       <w:r>
         <w:rPr>
           <w:b/>
@@ -98,6 +2190,7 @@
     </w:p>
     <w:p>
       <w:r>
+        <w:lastRenderedPageBreak/>
         <w:t>Eldar Fire Dragon’s Vengeance cancels spending dice to gain defence tokens.</w:t>
       </w:r>
     </w:p>
@@ -180,6 +2273,14 @@
         </w:rPr>
         <w:t>Special Card abilities</w:t>
       </w:r>
+      <w:r>
+        <w:rPr>
+          <w:b/>
+          <w:bCs/>
+          <w:u w:val="single"/>
+        </w:rPr>
+        <w:t xml:space="preserve"> clarifications</w:t>
+      </w:r>
     </w:p>
     <w:p>
       <w:pPr>
@@ -280,89 +2381,98 @@
           <w:b/>
           <w:bCs/>
         </w:rPr>
+        <w:t>Break the Line</w:t>
+      </w:r>
+    </w:p>
+    <w:p>
+      <w:r>
+        <w:t xml:space="preserve">Unit: Opponent chooses lowest value card. </w:t>
+      </w:r>
+      <w:r>
+        <w:t>Prioritized 1st</w:t>
+      </w:r>
+      <w:r>
+        <w:t xml:space="preserve"> tier, </w:t>
+      </w:r>
+      <w:r>
+        <w:t>2nd</w:t>
+      </w:r>
+      <w:r>
+        <w:t xml:space="preserve"> amount of icons on the card, </w:t>
+      </w:r>
+      <w:r>
+        <w:t>3rd</w:t>
+      </w:r>
+      <w:r>
+        <w:t xml:space="preserve"> random.</w:t>
+      </w:r>
+    </w:p>
+    <w:p/>
+    <w:p>
+      <w:r>
+        <w:rPr>
+          <w:b/>
+          <w:bCs/>
+        </w:rPr>
+        <w:t>Emperor’s Glory</w:t>
+      </w:r>
+      <w:r>
+        <w:rPr>
+          <w:b/>
+          <w:bCs/>
+        </w:rPr>
+        <w:br/>
+      </w:r>
+      <w:r>
+        <w:t xml:space="preserve">In rounds 1-2 ignore unit ability. In round 3 convert all safe dice to Morale. Calculated with opponent known combined attack vs </w:t>
+      </w:r>
+      <w:r>
+        <w:t>self combined defence. Rest of the dice are turned into morale.</w:t>
+      </w:r>
+    </w:p>
+    <w:p/>
+    <w:p>
+      <w:pPr>
+        <w:rPr>
+          <w:b/>
+          <w:bCs/>
+        </w:rPr>
+      </w:pPr>
+      <w:r>
+        <w:rPr>
+          <w:b/>
+          <w:bCs/>
+        </w:rPr>
+        <w:t>Chaos</w:t>
+      </w:r>
+    </w:p>
+    <w:p>
+      <w:pPr>
+        <w:rPr>
+          <w:b/>
+          <w:bCs/>
+        </w:rPr>
+      </w:pPr>
+      <w:r>
+        <w:rPr>
+          <w:b/>
+          <w:bCs/>
+        </w:rPr>
+        <w:t xml:space="preserve">Mark of </w:t>
+      </w:r>
+      <w:proofErr w:type="spellStart"/>
+      <w:r>
+        <w:rPr>
+          <w:b/>
+          <w:bCs/>
+        </w:rPr>
+        <w:t>Nurgle</w:t>
+      </w:r>
+      <w:proofErr w:type="spellEnd"/>
+    </w:p>
+    <w:p>
+      <w:r>
         <w:lastRenderedPageBreak/>
-        <w:t>Break the Line</w:t>
-      </w:r>
-    </w:p>
-    <w:p>
-      <w:r>
-        <w:t xml:space="preserve">Unit: Opponent chooses lowest value card. </w:t>
-      </w:r>
-      <w:r>
-        <w:t>Prioritized 1st</w:t>
-      </w:r>
-      <w:r>
-        <w:t xml:space="preserve"> tier, </w:t>
-      </w:r>
-      <w:r>
-        <w:t>2nd</w:t>
-      </w:r>
-      <w:r>
-        <w:t xml:space="preserve"> amount of icons on the card, </w:t>
-      </w:r>
-      <w:r>
-        <w:t>3rd</w:t>
-      </w:r>
-      <w:r>
-        <w:t xml:space="preserve"> random.</w:t>
-      </w:r>
-    </w:p>
-    <w:p/>
-    <w:p>
-      <w:r>
-        <w:rPr>
-          <w:b/>
-          <w:bCs/>
-        </w:rPr>
-        <w:t>Emperor’s Glory</w:t>
-      </w:r>
-      <w:r>
-        <w:rPr>
-          <w:b/>
-          <w:bCs/>
-        </w:rPr>
-        <w:br/>
-      </w:r>
-      <w:r>
-        <w:t xml:space="preserve">In rounds 1-2 ignore unit ability. In round 3 convert all safe dice to Morale. Calculated with opponent known combined attack vs </w:t>
-      </w:r>
-      <w:r>
-        <w:t>self combined defence. Rest of the dice are turned into morale.</w:t>
-      </w:r>
-    </w:p>
-    <w:p/>
-    <w:p>
-      <w:pPr>
-        <w:rPr>
-          <w:b/>
-          <w:bCs/>
-        </w:rPr>
-      </w:pPr>
-      <w:r>
-        <w:rPr>
-          <w:b/>
-          <w:bCs/>
-        </w:rPr>
-        <w:t>Chaos</w:t>
-      </w:r>
-    </w:p>
-    <w:p>
-      <w:pPr>
-        <w:rPr>
-          <w:b/>
-          <w:bCs/>
-        </w:rPr>
-      </w:pPr>
-      <w:r>
-        <w:rPr>
-          <w:b/>
-          <w:bCs/>
-        </w:rPr>
-        <w:t>Mark of Nurgle</w:t>
-      </w:r>
-    </w:p>
-    <w:p>
-      <w:r>
         <w:t xml:space="preserve">Unit: Always gain </w:t>
       </w:r>
       <w:r>
@@ -500,6 +2610,583 @@
     </w:sectPr>
   </w:body>
 </w:document>
+</file>
+
+<file path=word/numbering.xml><?xml version="1.0" encoding="utf-8"?>
+<w:numbering xmlns:wpc="http://schemas.microsoft.com/office/word/2010/wordprocessingCanvas" xmlns:cx="http://schemas.microsoft.com/office/drawing/2014/chartex" xmlns:cx1="http://schemas.microsoft.com/office/drawing/2015/9/8/chartex" xmlns:cx2="http://schemas.microsoft.com/office/drawing/2015/10/21/chartex" xmlns:cx3="http://schemas.microsoft.com/office/drawing/2016/5/9/chartex" xmlns:cx4="http://schemas.microsoft.com/office/drawing/2016/5/10/chartex" xmlns:cx5="http://schemas.microsoft.com/office/drawing/2016/5/11/chartex" xmlns:cx6="http://schemas.microsoft.com/office/drawing/2016/5/12/chartex" xmlns:cx7="http://schemas.microsoft.com/office/drawing/2016/5/13/chartex" xmlns:cx8="http://schemas.microsoft.com/office/drawing/2016/5/14/chartex" xmlns:mc="http://schemas.openxmlformats.org/markup-compatibility/2006" xmlns:aink="http://schemas.microsoft.com/office/drawing/2016/ink" xmlns:am3d="http://schemas.microsoft.com/office/drawing/2017/model3d" xmlns:o="urn:schemas-microsoft-com:office:office" xmlns:oel="http://schemas.microsoft.com/office/2019/extlst" xmlns:r="http://schemas.openxmlformats.org/officeDocument/2006/relationships" xmlns:m="http://schemas.openxmlformats.org/officeDocument/2006/math" xmlns:v="urn:schemas-microsoft-com:vml" xmlns:wp14="http://schemas.microsoft.com/office/word/2010/wordprocessingDrawing" xmlns:wp="http://schemas.openxmlformats.org/drawingml/2006/wordprocessingDrawing" xmlns:w10="urn:schemas-microsoft-com:office:word" xmlns:w="http://schemas.openxmlformats.org/wordprocessingml/2006/main" xmlns:w14="http://schemas.microsoft.com/office/word/2010/wordml" xmlns:w15="http://schemas.microsoft.com/office/word/2012/wordml" xmlns:w16cex="http://schemas.microsoft.com/office/word/2018/wordml/cex" xmlns:w16cid="http://schemas.microsoft.com/office/word/2016/wordml/cid" xmlns:w16="http://schemas.microsoft.com/office/word/2018/wordml" xmlns:w16du="http://schemas.microsoft.com/office/word/2023/wordml/word16du" xmlns:w16sdtdh="http://schemas.microsoft.com/office/word/2020/wordml/sdtdatahash" xmlns:w16sdtfl="http://schemas.microsoft.com/office/word/2024/wordml/sdtformatlock" xmlns:w16se="http://schemas.microsoft.com/office/word/2015/wordml/symex" xmlns:wpg="http://schemas.microsoft.com/office/word/2010/wordprocessingGroup" xmlns:wpi="http://schemas.microsoft.com/office/word/2010/wordprocessingInk" xmlns:wne="http://schemas.microsoft.com/office/word/2006/wordml" xmlns:wps="http://schemas.microsoft.com/office/word/2010/wordprocessingShape" mc:Ignorable="w14 w15 w16se w16cid w16 w16cex w16sdtdh w16sdtfl w16du wp14">
+  <w:abstractNum w:abstractNumId="0" w15:restartNumberingAfterBreak="0">
+    <w:nsid w:val="0EB44BED"/>
+    <w:multiLevelType w:val="hybridMultilevel"/>
+    <w:tmpl w:val="F6B62F48"/>
+    <w:lvl w:ilvl="0" w:tplc="A118A784">
+      <w:start w:val="5"/>
+      <w:numFmt w:val="bullet"/>
+      <w:lvlText w:val="-"/>
+      <w:lvlJc w:val="left"/>
+      <w:pPr>
+        <w:ind w:left="720" w:hanging="360"/>
+      </w:pPr>
+      <w:rPr>
+        <w:rFonts w:ascii="Aptos" w:eastAsiaTheme="minorHAnsi" w:hAnsi="Aptos" w:cstheme="minorBidi" w:hint="default"/>
+      </w:rPr>
+    </w:lvl>
+    <w:lvl w:ilvl="1" w:tplc="20000003" w:tentative="1">
+      <w:start w:val="1"/>
+      <w:numFmt w:val="bullet"/>
+      <w:lvlText w:val="o"/>
+      <w:lvlJc w:val="left"/>
+      <w:pPr>
+        <w:ind w:left="1440" w:hanging="360"/>
+      </w:pPr>
+      <w:rPr>
+        <w:rFonts w:ascii="Courier New" w:hAnsi="Courier New" w:cs="Courier New" w:hint="default"/>
+      </w:rPr>
+    </w:lvl>
+    <w:lvl w:ilvl="2" w:tplc="20000005" w:tentative="1">
+      <w:start w:val="1"/>
+      <w:numFmt w:val="bullet"/>
+      <w:lvlText w:val=""/>
+      <w:lvlJc w:val="left"/>
+      <w:pPr>
+        <w:ind w:left="2160" w:hanging="360"/>
+      </w:pPr>
+      <w:rPr>
+        <w:rFonts w:ascii="Wingdings" w:hAnsi="Wingdings" w:hint="default"/>
+      </w:rPr>
+    </w:lvl>
+    <w:lvl w:ilvl="3" w:tplc="20000001" w:tentative="1">
+      <w:start w:val="1"/>
+      <w:numFmt w:val="bullet"/>
+      <w:lvlText w:val=""/>
+      <w:lvlJc w:val="left"/>
+      <w:pPr>
+        <w:ind w:left="2880" w:hanging="360"/>
+      </w:pPr>
+      <w:rPr>
+        <w:rFonts w:ascii="Symbol" w:hAnsi="Symbol" w:hint="default"/>
+      </w:rPr>
+    </w:lvl>
+    <w:lvl w:ilvl="4" w:tplc="20000003" w:tentative="1">
+      <w:start w:val="1"/>
+      <w:numFmt w:val="bullet"/>
+      <w:lvlText w:val="o"/>
+      <w:lvlJc w:val="left"/>
+      <w:pPr>
+        <w:ind w:left="3600" w:hanging="360"/>
+      </w:pPr>
+      <w:rPr>
+        <w:rFonts w:ascii="Courier New" w:hAnsi="Courier New" w:cs="Courier New" w:hint="default"/>
+      </w:rPr>
+    </w:lvl>
+    <w:lvl w:ilvl="5" w:tplc="20000005" w:tentative="1">
+      <w:start w:val="1"/>
+      <w:numFmt w:val="bullet"/>
+      <w:lvlText w:val=""/>
+      <w:lvlJc w:val="left"/>
+      <w:pPr>
+        <w:ind w:left="4320" w:hanging="360"/>
+      </w:pPr>
+      <w:rPr>
+        <w:rFonts w:ascii="Wingdings" w:hAnsi="Wingdings" w:hint="default"/>
+      </w:rPr>
+    </w:lvl>
+    <w:lvl w:ilvl="6" w:tplc="20000001" w:tentative="1">
+      <w:start w:val="1"/>
+      <w:numFmt w:val="bullet"/>
+      <w:lvlText w:val=""/>
+      <w:lvlJc w:val="left"/>
+      <w:pPr>
+        <w:ind w:left="5040" w:hanging="360"/>
+      </w:pPr>
+      <w:rPr>
+        <w:rFonts w:ascii="Symbol" w:hAnsi="Symbol" w:hint="default"/>
+      </w:rPr>
+    </w:lvl>
+    <w:lvl w:ilvl="7" w:tplc="20000003" w:tentative="1">
+      <w:start w:val="1"/>
+      <w:numFmt w:val="bullet"/>
+      <w:lvlText w:val="o"/>
+      <w:lvlJc w:val="left"/>
+      <w:pPr>
+        <w:ind w:left="5760" w:hanging="360"/>
+      </w:pPr>
+      <w:rPr>
+        <w:rFonts w:ascii="Courier New" w:hAnsi="Courier New" w:cs="Courier New" w:hint="default"/>
+      </w:rPr>
+    </w:lvl>
+    <w:lvl w:ilvl="8" w:tplc="20000005" w:tentative="1">
+      <w:start w:val="1"/>
+      <w:numFmt w:val="bullet"/>
+      <w:lvlText w:val=""/>
+      <w:lvlJc w:val="left"/>
+      <w:pPr>
+        <w:ind w:left="6480" w:hanging="360"/>
+      </w:pPr>
+      <w:rPr>
+        <w:rFonts w:ascii="Wingdings" w:hAnsi="Wingdings" w:hint="default"/>
+      </w:rPr>
+    </w:lvl>
+  </w:abstractNum>
+  <w:abstractNum w:abstractNumId="1" w15:restartNumberingAfterBreak="0">
+    <w:nsid w:val="328B2D88"/>
+    <w:multiLevelType w:val="multilevel"/>
+    <w:tmpl w:val="C2BC24AA"/>
+    <w:lvl w:ilvl="0">
+      <w:start w:val="1"/>
+      <w:numFmt w:val="decimal"/>
+      <w:lvlText w:val="%1."/>
+      <w:lvlJc w:val="left"/>
+      <w:pPr>
+        <w:tabs>
+          <w:tab w:val="num" w:pos="720"/>
+        </w:tabs>
+        <w:ind w:left="720" w:hanging="360"/>
+      </w:pPr>
+      <w:rPr>
+        <w:rFonts w:asciiTheme="minorHAnsi" w:eastAsiaTheme="minorHAnsi" w:hAnsiTheme="minorHAnsi" w:cstheme="minorBidi"/>
+        <w:sz w:val="20"/>
+      </w:rPr>
+    </w:lvl>
+    <w:lvl w:ilvl="1">
+      <w:start w:val="1"/>
+      <w:numFmt w:val="bullet"/>
+      <w:lvlText w:val="o"/>
+      <w:lvlJc w:val="left"/>
+      <w:pPr>
+        <w:tabs>
+          <w:tab w:val="num" w:pos="1440"/>
+        </w:tabs>
+        <w:ind w:left="1440" w:hanging="360"/>
+      </w:pPr>
+      <w:rPr>
+        <w:rFonts w:ascii="Courier New" w:hAnsi="Courier New" w:hint="default"/>
+        <w:sz w:val="20"/>
+      </w:rPr>
+    </w:lvl>
+    <w:lvl w:ilvl="2" w:tentative="1">
+      <w:start w:val="1"/>
+      <w:numFmt w:val="bullet"/>
+      <w:lvlText w:val=""/>
+      <w:lvlJc w:val="left"/>
+      <w:pPr>
+        <w:tabs>
+          <w:tab w:val="num" w:pos="2160"/>
+        </w:tabs>
+        <w:ind w:left="2160" w:hanging="360"/>
+      </w:pPr>
+      <w:rPr>
+        <w:rFonts w:ascii="Wingdings" w:hAnsi="Wingdings" w:hint="default"/>
+        <w:sz w:val="20"/>
+      </w:rPr>
+    </w:lvl>
+    <w:lvl w:ilvl="3" w:tentative="1">
+      <w:start w:val="1"/>
+      <w:numFmt w:val="bullet"/>
+      <w:lvlText w:val=""/>
+      <w:lvlJc w:val="left"/>
+      <w:pPr>
+        <w:tabs>
+          <w:tab w:val="num" w:pos="2880"/>
+        </w:tabs>
+        <w:ind w:left="2880" w:hanging="360"/>
+      </w:pPr>
+      <w:rPr>
+        <w:rFonts w:ascii="Wingdings" w:hAnsi="Wingdings" w:hint="default"/>
+        <w:sz w:val="20"/>
+      </w:rPr>
+    </w:lvl>
+    <w:lvl w:ilvl="4" w:tentative="1">
+      <w:start w:val="1"/>
+      <w:numFmt w:val="bullet"/>
+      <w:lvlText w:val=""/>
+      <w:lvlJc w:val="left"/>
+      <w:pPr>
+        <w:tabs>
+          <w:tab w:val="num" w:pos="3600"/>
+        </w:tabs>
+        <w:ind w:left="3600" w:hanging="360"/>
+      </w:pPr>
+      <w:rPr>
+        <w:rFonts w:ascii="Wingdings" w:hAnsi="Wingdings" w:hint="default"/>
+        <w:sz w:val="20"/>
+      </w:rPr>
+    </w:lvl>
+    <w:lvl w:ilvl="5" w:tentative="1">
+      <w:start w:val="1"/>
+      <w:numFmt w:val="bullet"/>
+      <w:lvlText w:val=""/>
+      <w:lvlJc w:val="left"/>
+      <w:pPr>
+        <w:tabs>
+          <w:tab w:val="num" w:pos="4320"/>
+        </w:tabs>
+        <w:ind w:left="4320" w:hanging="360"/>
+      </w:pPr>
+      <w:rPr>
+        <w:rFonts w:ascii="Wingdings" w:hAnsi="Wingdings" w:hint="default"/>
+        <w:sz w:val="20"/>
+      </w:rPr>
+    </w:lvl>
+    <w:lvl w:ilvl="6" w:tentative="1">
+      <w:start w:val="1"/>
+      <w:numFmt w:val="bullet"/>
+      <w:lvlText w:val=""/>
+      <w:lvlJc w:val="left"/>
+      <w:pPr>
+        <w:tabs>
+          <w:tab w:val="num" w:pos="5040"/>
+        </w:tabs>
+        <w:ind w:left="5040" w:hanging="360"/>
+      </w:pPr>
+      <w:rPr>
+        <w:rFonts w:ascii="Wingdings" w:hAnsi="Wingdings" w:hint="default"/>
+        <w:sz w:val="20"/>
+      </w:rPr>
+    </w:lvl>
+    <w:lvl w:ilvl="7" w:tentative="1">
+      <w:start w:val="1"/>
+      <w:numFmt w:val="bullet"/>
+      <w:lvlText w:val=""/>
+      <w:lvlJc w:val="left"/>
+      <w:pPr>
+        <w:tabs>
+          <w:tab w:val="num" w:pos="5760"/>
+        </w:tabs>
+        <w:ind w:left="5760" w:hanging="360"/>
+      </w:pPr>
+      <w:rPr>
+        <w:rFonts w:ascii="Wingdings" w:hAnsi="Wingdings" w:hint="default"/>
+        <w:sz w:val="20"/>
+      </w:rPr>
+    </w:lvl>
+    <w:lvl w:ilvl="8" w:tentative="1">
+      <w:start w:val="1"/>
+      <w:numFmt w:val="bullet"/>
+      <w:lvlText w:val=""/>
+      <w:lvlJc w:val="left"/>
+      <w:pPr>
+        <w:tabs>
+          <w:tab w:val="num" w:pos="6480"/>
+        </w:tabs>
+        <w:ind w:left="6480" w:hanging="360"/>
+      </w:pPr>
+      <w:rPr>
+        <w:rFonts w:ascii="Wingdings" w:hAnsi="Wingdings" w:hint="default"/>
+        <w:sz w:val="20"/>
+      </w:rPr>
+    </w:lvl>
+  </w:abstractNum>
+  <w:abstractNum w:abstractNumId="2" w15:restartNumberingAfterBreak="0">
+    <w:nsid w:val="49B90BCF"/>
+    <w:multiLevelType w:val="multilevel"/>
+    <w:tmpl w:val="89947AD6"/>
+    <w:lvl w:ilvl="0">
+      <w:start w:val="1"/>
+      <w:numFmt w:val="bullet"/>
+      <w:lvlText w:val=""/>
+      <w:lvlJc w:val="left"/>
+      <w:pPr>
+        <w:tabs>
+          <w:tab w:val="num" w:pos="720"/>
+        </w:tabs>
+        <w:ind w:left="720" w:hanging="360"/>
+      </w:pPr>
+      <w:rPr>
+        <w:rFonts w:ascii="Symbol" w:hAnsi="Symbol" w:hint="default"/>
+        <w:sz w:val="20"/>
+      </w:rPr>
+    </w:lvl>
+    <w:lvl w:ilvl="1">
+      <w:start w:val="1"/>
+      <w:numFmt w:val="bullet"/>
+      <w:lvlText w:val="o"/>
+      <w:lvlJc w:val="left"/>
+      <w:pPr>
+        <w:tabs>
+          <w:tab w:val="num" w:pos="1440"/>
+        </w:tabs>
+        <w:ind w:left="1440" w:hanging="360"/>
+      </w:pPr>
+      <w:rPr>
+        <w:rFonts w:ascii="Courier New" w:hAnsi="Courier New" w:hint="default"/>
+        <w:sz w:val="20"/>
+      </w:rPr>
+    </w:lvl>
+    <w:lvl w:ilvl="2" w:tentative="1">
+      <w:start w:val="1"/>
+      <w:numFmt w:val="bullet"/>
+      <w:lvlText w:val=""/>
+      <w:lvlJc w:val="left"/>
+      <w:pPr>
+        <w:tabs>
+          <w:tab w:val="num" w:pos="2160"/>
+        </w:tabs>
+        <w:ind w:left="2160" w:hanging="360"/>
+      </w:pPr>
+      <w:rPr>
+        <w:rFonts w:ascii="Wingdings" w:hAnsi="Wingdings" w:hint="default"/>
+        <w:sz w:val="20"/>
+      </w:rPr>
+    </w:lvl>
+    <w:lvl w:ilvl="3" w:tentative="1">
+      <w:start w:val="1"/>
+      <w:numFmt w:val="bullet"/>
+      <w:lvlText w:val=""/>
+      <w:lvlJc w:val="left"/>
+      <w:pPr>
+        <w:tabs>
+          <w:tab w:val="num" w:pos="2880"/>
+        </w:tabs>
+        <w:ind w:left="2880" w:hanging="360"/>
+      </w:pPr>
+      <w:rPr>
+        <w:rFonts w:ascii="Wingdings" w:hAnsi="Wingdings" w:hint="default"/>
+        <w:sz w:val="20"/>
+      </w:rPr>
+    </w:lvl>
+    <w:lvl w:ilvl="4" w:tentative="1">
+      <w:start w:val="1"/>
+      <w:numFmt w:val="bullet"/>
+      <w:lvlText w:val=""/>
+      <w:lvlJc w:val="left"/>
+      <w:pPr>
+        <w:tabs>
+          <w:tab w:val="num" w:pos="3600"/>
+        </w:tabs>
+        <w:ind w:left="3600" w:hanging="360"/>
+      </w:pPr>
+      <w:rPr>
+        <w:rFonts w:ascii="Wingdings" w:hAnsi="Wingdings" w:hint="default"/>
+        <w:sz w:val="20"/>
+      </w:rPr>
+    </w:lvl>
+    <w:lvl w:ilvl="5" w:tentative="1">
+      <w:start w:val="1"/>
+      <w:numFmt w:val="bullet"/>
+      <w:lvlText w:val=""/>
+      <w:lvlJc w:val="left"/>
+      <w:pPr>
+        <w:tabs>
+          <w:tab w:val="num" w:pos="4320"/>
+        </w:tabs>
+        <w:ind w:left="4320" w:hanging="360"/>
+      </w:pPr>
+      <w:rPr>
+        <w:rFonts w:ascii="Wingdings" w:hAnsi="Wingdings" w:hint="default"/>
+        <w:sz w:val="20"/>
+      </w:rPr>
+    </w:lvl>
+    <w:lvl w:ilvl="6" w:tentative="1">
+      <w:start w:val="1"/>
+      <w:numFmt w:val="bullet"/>
+      <w:lvlText w:val=""/>
+      <w:lvlJc w:val="left"/>
+      <w:pPr>
+        <w:tabs>
+          <w:tab w:val="num" w:pos="5040"/>
+        </w:tabs>
+        <w:ind w:left="5040" w:hanging="360"/>
+      </w:pPr>
+      <w:rPr>
+        <w:rFonts w:ascii="Wingdings" w:hAnsi="Wingdings" w:hint="default"/>
+        <w:sz w:val="20"/>
+      </w:rPr>
+    </w:lvl>
+    <w:lvl w:ilvl="7" w:tentative="1">
+      <w:start w:val="1"/>
+      <w:numFmt w:val="bullet"/>
+      <w:lvlText w:val=""/>
+      <w:lvlJc w:val="left"/>
+      <w:pPr>
+        <w:tabs>
+          <w:tab w:val="num" w:pos="5760"/>
+        </w:tabs>
+        <w:ind w:left="5760" w:hanging="360"/>
+      </w:pPr>
+      <w:rPr>
+        <w:rFonts w:ascii="Wingdings" w:hAnsi="Wingdings" w:hint="default"/>
+        <w:sz w:val="20"/>
+      </w:rPr>
+    </w:lvl>
+    <w:lvl w:ilvl="8" w:tentative="1">
+      <w:start w:val="1"/>
+      <w:numFmt w:val="bullet"/>
+      <w:lvlText w:val=""/>
+      <w:lvlJc w:val="left"/>
+      <w:pPr>
+        <w:tabs>
+          <w:tab w:val="num" w:pos="6480"/>
+        </w:tabs>
+        <w:ind w:left="6480" w:hanging="360"/>
+      </w:pPr>
+      <w:rPr>
+        <w:rFonts w:ascii="Wingdings" w:hAnsi="Wingdings" w:hint="default"/>
+        <w:sz w:val="20"/>
+      </w:rPr>
+    </w:lvl>
+  </w:abstractNum>
+  <w:abstractNum w:abstractNumId="3" w15:restartNumberingAfterBreak="0">
+    <w:nsid w:val="7672338B"/>
+    <w:multiLevelType w:val="multilevel"/>
+    <w:tmpl w:val="40AEA308"/>
+    <w:lvl w:ilvl="0">
+      <w:start w:val="1"/>
+      <w:numFmt w:val="bullet"/>
+      <w:lvlText w:val=""/>
+      <w:lvlJc w:val="left"/>
+      <w:pPr>
+        <w:tabs>
+          <w:tab w:val="num" w:pos="720"/>
+        </w:tabs>
+        <w:ind w:left="720" w:hanging="360"/>
+      </w:pPr>
+      <w:rPr>
+        <w:rFonts w:ascii="Symbol" w:hAnsi="Symbol" w:hint="default"/>
+        <w:sz w:val="20"/>
+      </w:rPr>
+    </w:lvl>
+    <w:lvl w:ilvl="1" w:tentative="1">
+      <w:start w:val="1"/>
+      <w:numFmt w:val="bullet"/>
+      <w:lvlText w:val="o"/>
+      <w:lvlJc w:val="left"/>
+      <w:pPr>
+        <w:tabs>
+          <w:tab w:val="num" w:pos="1440"/>
+        </w:tabs>
+        <w:ind w:left="1440" w:hanging="360"/>
+      </w:pPr>
+      <w:rPr>
+        <w:rFonts w:ascii="Courier New" w:hAnsi="Courier New" w:hint="default"/>
+        <w:sz w:val="20"/>
+      </w:rPr>
+    </w:lvl>
+    <w:lvl w:ilvl="2" w:tentative="1">
+      <w:start w:val="1"/>
+      <w:numFmt w:val="bullet"/>
+      <w:lvlText w:val=""/>
+      <w:lvlJc w:val="left"/>
+      <w:pPr>
+        <w:tabs>
+          <w:tab w:val="num" w:pos="2160"/>
+        </w:tabs>
+        <w:ind w:left="2160" w:hanging="360"/>
+      </w:pPr>
+      <w:rPr>
+        <w:rFonts w:ascii="Wingdings" w:hAnsi="Wingdings" w:hint="default"/>
+        <w:sz w:val="20"/>
+      </w:rPr>
+    </w:lvl>
+    <w:lvl w:ilvl="3" w:tentative="1">
+      <w:start w:val="1"/>
+      <w:numFmt w:val="bullet"/>
+      <w:lvlText w:val=""/>
+      <w:lvlJc w:val="left"/>
+      <w:pPr>
+        <w:tabs>
+          <w:tab w:val="num" w:pos="2880"/>
+        </w:tabs>
+        <w:ind w:left="2880" w:hanging="360"/>
+      </w:pPr>
+      <w:rPr>
+        <w:rFonts w:ascii="Wingdings" w:hAnsi="Wingdings" w:hint="default"/>
+        <w:sz w:val="20"/>
+      </w:rPr>
+    </w:lvl>
+    <w:lvl w:ilvl="4" w:tentative="1">
+      <w:start w:val="1"/>
+      <w:numFmt w:val="bullet"/>
+      <w:lvlText w:val=""/>
+      <w:lvlJc w:val="left"/>
+      <w:pPr>
+        <w:tabs>
+          <w:tab w:val="num" w:pos="3600"/>
+        </w:tabs>
+        <w:ind w:left="3600" w:hanging="360"/>
+      </w:pPr>
+      <w:rPr>
+        <w:rFonts w:ascii="Wingdings" w:hAnsi="Wingdings" w:hint="default"/>
+        <w:sz w:val="20"/>
+      </w:rPr>
+    </w:lvl>
+    <w:lvl w:ilvl="5" w:tentative="1">
+      <w:start w:val="1"/>
+      <w:numFmt w:val="bullet"/>
+      <w:lvlText w:val=""/>
+      <w:lvlJc w:val="left"/>
+      <w:pPr>
+        <w:tabs>
+          <w:tab w:val="num" w:pos="4320"/>
+        </w:tabs>
+        <w:ind w:left="4320" w:hanging="360"/>
+      </w:pPr>
+      <w:rPr>
+        <w:rFonts w:ascii="Wingdings" w:hAnsi="Wingdings" w:hint="default"/>
+        <w:sz w:val="20"/>
+      </w:rPr>
+    </w:lvl>
+    <w:lvl w:ilvl="6" w:tentative="1">
+      <w:start w:val="1"/>
+      <w:numFmt w:val="bullet"/>
+      <w:lvlText w:val=""/>
+      <w:lvlJc w:val="left"/>
+      <w:pPr>
+        <w:tabs>
+          <w:tab w:val="num" w:pos="5040"/>
+        </w:tabs>
+        <w:ind w:left="5040" w:hanging="360"/>
+      </w:pPr>
+      <w:rPr>
+        <w:rFonts w:ascii="Wingdings" w:hAnsi="Wingdings" w:hint="default"/>
+        <w:sz w:val="20"/>
+      </w:rPr>
+    </w:lvl>
+    <w:lvl w:ilvl="7" w:tentative="1">
+      <w:start w:val="1"/>
+      <w:numFmt w:val="bullet"/>
+      <w:lvlText w:val=""/>
+      <w:lvlJc w:val="left"/>
+      <w:pPr>
+        <w:tabs>
+          <w:tab w:val="num" w:pos="5760"/>
+        </w:tabs>
+        <w:ind w:left="5760" w:hanging="360"/>
+      </w:pPr>
+      <w:rPr>
+        <w:rFonts w:ascii="Wingdings" w:hAnsi="Wingdings" w:hint="default"/>
+        <w:sz w:val="20"/>
+      </w:rPr>
+    </w:lvl>
+    <w:lvl w:ilvl="8" w:tentative="1">
+      <w:start w:val="1"/>
+      <w:numFmt w:val="bullet"/>
+      <w:lvlText w:val=""/>
+      <w:lvlJc w:val="left"/>
+      <w:pPr>
+        <w:tabs>
+          <w:tab w:val="num" w:pos="6480"/>
+        </w:tabs>
+        <w:ind w:left="6480" w:hanging="360"/>
+      </w:pPr>
+      <w:rPr>
+        <w:rFonts w:ascii="Wingdings" w:hAnsi="Wingdings" w:hint="default"/>
+        <w:sz w:val="20"/>
+      </w:rPr>
+    </w:lvl>
+  </w:abstractNum>
+  <w:num w:numId="1" w16cid:durableId="1052387465">
+    <w:abstractNumId w:val="0"/>
+  </w:num>
+  <w:num w:numId="2" w16cid:durableId="734203416">
+    <w:abstractNumId w:val="1"/>
+  </w:num>
+  <w:num w:numId="3" w16cid:durableId="1823959911">
+    <w:abstractNumId w:val="2"/>
+  </w:num>
+  <w:num w:numId="4" w16cid:durableId="1895921097">
+    <w:abstractNumId w:val="3"/>
+  </w:num>
+</w:numbering>
 </file>
 
 <file path=word/styles.xml><?xml version="1.0" encoding="utf-8"?>

</xml_diff>